<commit_message>
Refine decision scenarios and add high-sensitivity Q4 threshold
</commit_message>
<xml_diff>
--- a/problems/25年C题/完整论文.docx
+++ b/problems/25年C题/完整论文.docx
@@ -55,7 +55,7 @@
           <w:b w:val="0"/>
           <w:sz w:val="24"/>
         </w:rPr>
-        <w:t>针对问题一，在Y染色体浓度的logit尺度上建立随机截距线性混合模型，并以低维加性样条作对照。孕周系数为0.04701，BMI系数为−0.02446，组内相关系数为0.7283；但按孕妇留出的预测决定系数为−0.0302，说明群体相关关系与个体预测能力不能等同。针对问题二，建立随机截距二项模型，对新孕妇随机效应积分获得边际达标概率，再以动态规划联合确定连续BMI分组与检测时点。在4%阈值、每日搜索网格和指定中延迟风险权重下，三组条件时点为11周、11周6天、12周6天，样本人数分别为200、25、42。</w:t>
+        <w:t>针对问题一，在Y染色体浓度的logit尺度上建立随机截距线性混合模型，并以低维加性样条作对照。孕周系数为0.04701，BMI系数为−0.02446，组内相关系数为0.7283；但按孕妇留出的预测决定系数为−0.0302，说明群体相关关系与个体预测能力不能等同。针对问题二，建立随机截距二项模型，对新孕妇随机效应积分获得边际达标概率，再以动态规划联合确定连续BMI分组与检测时点。在4%阈值、每日搜索网格和中延迟M情景下，三组条件时点为11周、11周6天、12周6天，样本人数分别为200、25、42。</w:t>
       </w:r>
     </w:p>
     <w:p>
@@ -83,7 +83,7 @@
           <w:b w:val="0"/>
           <w:sz w:val="24"/>
         </w:rPr>
-        <w:t>针对问题四，采用主体隔离的正则化Logistic模型分别识别总体异常标记及T13、T18、T21标记。总体标记的平均精确率为0.3823，Brier分数为0.08419；T21平均精确率仅0.0302，表现不足。全文通过分组交叉验证、概率校准检查、可行性约束和敏感性分析给出可复核的题目解答，同时明确观测性数据、稀有标签和预约前变量可得性对推广的限制。</w:t>
+        <w:t>针对问题四，采用主体隔离的正则化Logistic模型分别识别总体异常标记及T13、T18、T21标记。总体标记的平均精确率为0.3823，Brier分数为0.08419；T21平均精确率仅0.0302，表现不足。除MCC阈值外，增加训练层灵敏度目标为90%的高灵敏度约束阈值，作为漏诊优先的对照方案。全文通过分组交叉验证、概率校准检查、可行性约束和敏感性分析给出可复核的题目解答。</w:t>
       </w:r>
     </w:p>
     <w:p>
@@ -238,7 +238,7 @@
           <w:b w:val="0"/>
           <w:sz w:val="24"/>
         </w:rPr>
-        <w:t>本文给出的BMI区间和孕周是附件人群、指定风险函数和既定信息条件下的计算解，而不是临床诊疗建议。附件没有随机分配检测时点，也没有完整观察每位孕妇首次达到阈值的全过程。因此，本文不声称识别了改变检测时点的因果效应。对于超出样本BMI范围、观测稀少的早孕时段，以及具有不同测序平台、随访机制的人群，应先补充数据再重新估计，而不能直接套用表中的数字。</w:t>
+        <w:t>本文给出的BMI区间和孕周是附件人群、指定风险函数和既定信息条件下的计算解。由于附件不是随机时点试验，表中方案需在独立人群中重新估计和验证。</w:t>
       </w:r>
     </w:p>
     <w:p>
@@ -3796,21 +3796,7 @@
           <w:b w:val="0"/>
           <w:sz w:val="24"/>
         </w:rPr>
-        <w:t>267名男胎孕妇中有217名在首次观测时已经达标，只知道真实首次达标发生在该时点或之前；43名在随访中出现未达标转为达标，但事件只能定位于两次采样之间；7名从未观察到达标，仍不能断言其未来不会达标。此外，34名出现阈值反转，使单调不可逆事件假设受到挑战。直接把首次观测到达标的孕周当作真实首次达标时间，会将抽血安排误认为生理过程。</w:t>
-      </w:r>
-    </w:p>
-    <w:p>
-      <w:pPr>
-        <w:spacing w:before="0" w:after="0" w:line="264" w:lineRule="auto"/>
-        <w:ind w:firstLine="480"/>
-      </w:pPr>
-      <w:r>
-        <w:rPr>
-          <w:rFonts w:ascii="Times New Roman" w:hAnsi="Times New Roman" w:eastAsia="宋体"/>
-          <w:b w:val="0"/>
-          <w:sz w:val="24"/>
-        </w:rPr>
-        <w:t>因此，本文采用“某孕周的一次检测是否达标”为可识别目标，优化的是这一观测达标概率对应的风险，而不把它冒称为潜在首次达标时间分布。生存分析可以在额外假设下处理删失，但本题若要直接采用，还需说明反转、检测误差和随访选择机制。本文不在信息不足时强行增加一个难以验证的事件模型。</w:t>
+        <w:t>由于217名孕妇首次观测时已达标、43名在随访中才观察到转为达标，且34名出现阈值反转，真实首次达标时间并不能从附件直接识别。本文因此回答可观测问题：“某孕周的一次检测是否达标”，不把首次观测时间冒称为生理事件时间。</w:t>
       </w:r>
     </w:p>
     <w:p>
@@ -4271,21 +4257,7 @@
           <w:b w:val="0"/>
           <w:sz w:val="24"/>
         </w:rPr>
-        <w:t>图6中预测概率0.90至0.95的区间平均预测约0.924，而实际达标比例约0.872，提示高概率区域存在乐观偏差。因此不能直接给出“达到95%就安全”的保证。嵌套校准和低维样条变体的主体Brier分别约0.11278、0.11126和0.11231，未改变缺乏稳定增益的总体判断。校准参数仅在训练层估计，避免利用外层结果选择修正方式。</w:t>
-      </w:r>
-    </w:p>
-    <w:p>
-      <w:pPr>
-        <w:spacing w:before="0" w:after="0" w:line="264" w:lineRule="auto"/>
-        <w:ind w:firstLine="480"/>
-      </w:pPr>
-      <w:r>
-        <w:rPr>
-          <w:rFonts w:ascii="Times New Roman" w:hAnsi="Times New Roman" w:eastAsia="宋体"/>
-          <w:b w:val="0"/>
-          <w:sz w:val="24"/>
-        </w:rPr>
-        <w:t>图7展示检测孕周的观测支持。仅69名孕妇的首次观测不晚于12周，早期数据覆盖有限。在69名早期主体上的敏感性分析会使预测产生可见变化，说明早期推荐尤其依赖样本选择。优化时增加“推荐周附近必须有足够主体观测”的约束可以限制明显无支持的解，但它不能凭空产生尚未采集的早孕信息。</w:t>
+        <w:t>图6显示高概率区间存在一定乐观偏差，嵌套校准和样条变体也未改变总体判断。图7显示不晚于12周的首次观测仅69名，故早期方案的外推性有限。</w:t>
       </w:r>
     </w:p>
     <w:p>
@@ -4366,7 +4338,7 @@
           <w:b w:val="0"/>
           <w:sz w:val="24"/>
         </w:rPr>
-        <w:t>将失败损失定为1，定义式（5）的条件风险。每周延迟代价λ与13周起附加代价δ为外部输入。主展示情景采用λ=0.02、δ=0.10；另外考察λ为0、0.005和0.05的情景。题面给出的晚期风险等级没有对应的定量效用数据，故本文不声称这些权重由附件估计。搜索范围为11至25周，按一天离散；28周后的阶段不在该搜索域内。</w:t>
+        <w:t>将失败损失定为1，定义式（5）的条件风险。每周延迟代价λ与13周起附加代价δ为外部输入，并正式命名三种情景：低延迟L（λ=0.005，δ=0.10）、中延迟M（λ=0.020，δ=0.10）和高延迟H（λ=0.050，δ=0.10）。本文选M作为主答案，因为它同时保留失败风险和等待代价的影响，既没有把所有方案推到11周边界，也没有像L那样频繁出现25周边界；L、H用于敏感性对照。三组权重均是演示性外部情景，不由附件估计。搜索范围为11至25周，按一天离散；28周后的阶段不在该搜索域内。</w:t>
       </w:r>
     </w:p>
     <w:p>
@@ -4590,7 +4562,7 @@
           <w:b w:val="0"/>
           <w:sz w:val="24"/>
         </w:rPr>
-        <w:t>上述最优性仅针对已给定的概率、离散网格和约束。每个最优k组方案的最后一组必为某个连续区间，若其前k−1组并非相应前缀的最优解，就能替换后得到更小总损失，与最优性矛盾，因此递推穷尽合法划分即可得到离散全局最优。它不意味着风险函数正确，更不意味着医学意义上的全局最优。</w:t>
+        <w:t>上述最优性针对给定概率、离散网格和约束；它是计算意义上的离散最优，不等同于医学意义上的全局最优。</w:t>
       </w:r>
     </w:p>
     <w:p>
@@ -4631,7 +4603,7 @@
           <w:b w:val="0"/>
           <w:sz w:val="24"/>
         </w:rPr>
-        <w:t>表5给出完整样本在4%阈值、中延迟情景下的有效三组方案。BMI边界展示至四位小数，实际计算使用未舍入值；区间左闭右开，最后一组包含样本上端点。第一组对应200名孕妇，11周为搜索下界；后两组分别为25名和42名孕妇。表中的人数是本附件的分组人数，不是对未来人群比例的估计。</w:t>
+        <w:t>表5给出完整样本在4%阈值、中延迟M情景下的有效三组方案。BMI边界仅展示到1位小数，实际计算使用未舍入值；区间左闭右开，最后一组包含样本上端点。第一组对应200名孕妇，11周为搜索下界；后两组分别为25名和42名孕妇。表中的人数是本附件的分组人数，不是对未来人群比例的估计。</w:t>
       </w:r>
     </w:p>
     <w:p>
@@ -4801,7 +4773,7 @@
                 <w:b w:val="0"/>
                 <w:sz w:val="20"/>
               </w:rPr>
-              <w:t>[20.7031, 33.3589)</w:t>
+              <w:t>[20.7, 33.4)</w:t>
             </w:r>
           </w:p>
         </w:tc>
@@ -4899,7 +4871,7 @@
                 <w:b w:val="0"/>
                 <w:sz w:val="20"/>
               </w:rPr>
-              <w:t>[33.3589, 34.4118)</w:t>
+              <w:t>[33.4, 34.4)</w:t>
             </w:r>
           </w:p>
         </w:tc>
@@ -4997,7 +4969,7 @@
                 <w:b w:val="0"/>
                 <w:sz w:val="20"/>
               </w:rPr>
-              <w:t>[34.4118, 46.8750]</w:t>
+              <w:t>[34.4, 46.9]</w:t>
             </w:r>
           </w:p>
         </w:tc>
@@ -5086,21 +5058,7 @@
           <w:b w:val="0"/>
           <w:sz w:val="24"/>
         </w:rPr>
-        <w:t>该表回答了题目要求的“如何分组、何时检测”，但必须连同风险权重解释。特别是12周6天靠近13周附加损失开始的前一天，体现离散风险设定，而不是生理机制证明该天特殊。11周是搜索域边界，也不能被解释为更早孕周必然不合适。观测不足、概率校准偏差及风险权重变化均可能改变表中时点。</w:t>
-      </w:r>
-    </w:p>
-    <w:p>
-      <w:pPr>
-        <w:spacing w:before="0" w:after="0" w:line="264" w:lineRule="auto"/>
-        <w:ind w:firstLine="480"/>
-      </w:pPr>
-      <w:r>
-        <w:rPr>
-          <w:rFonts w:ascii="Times New Roman" w:hAnsi="Times New Roman" w:eastAsia="宋体"/>
-          <w:b w:val="0"/>
-          <w:sz w:val="24"/>
-        </w:rPr>
-        <w:t>当外层训练集产生一个策略，再把留出孕妇协变量代入训练模型计算期望风险时，所得只是模型自评风险，不能视为真实接受策略后的检测效果。本文把外层概率验证和全样本条件解分开报告，避免将二者混成已经完成前瞻性验证的结论。部署前应利用新的独立队列考察实际失败率和复检成本，才能进一步判断决策价值。</w:t>
+        <w:t>该表给出题目所需的分组与时点答案；12周6天靠近13周阶跃前一天，主要体现M情景的离散代价设定。11周是搜索下界。全样本条件解与外层概率验证分开报告，部署前仍需用独立队列核对实际失败率和复检成本。</w:t>
       </w:r>
     </w:p>
     <w:p>
@@ -5142,7 +5100,7 @@
           <w:b w:val="0"/>
           <w:sz w:val="24"/>
         </w:rPr>
-        <w:t>问题三要求考虑更多因素，但变量越多不等于答案越可靠。本文从预约前可得性和模型稳定性出发，固定两个扩展规格：基础扩展在Q2的孕周和基线BMI之外加入首条记录年龄、身高；完整扩展进一步加入辅助受孕、孕次与产次代理。BMI已包含体重和身高的组合信息，基础扩展不再把原体重与BMI、身高同时线性输入，以降低明显共线性。图8展示主要基线协变量分布与相互关系。</w:t>
+        <w:t>问题三在Q2基础上加入首条记录年龄、身高，并在完整规格中加入辅助受孕、孕次与产次代理。为避免明显共线性，基础规格不再同时输入原体重、身高和BMI。图8展示主要基线协变量分布。</w:t>
       </w:r>
     </w:p>
     <w:p>
@@ -5210,21 +5168,7 @@
           <w:b w:val="0"/>
           <w:sz w:val="24"/>
         </w:rPr>
-        <w:t>辅助受孕由附件标记编码，孕次中的“至少3次”等开放上端类别按3作代理，其含义是有序近似而非精确次数。该简化可能降低模型表达能力，故完整扩展不被视为多因素建模的全部可能形式。当前比较只回答这两个固定规格能否在相同数据和验证方式下稳定改进预测，不对未试验模型作否定判断。</w:t>
-      </w:r>
-    </w:p>
-    <w:p>
-      <w:pPr>
-        <w:spacing w:before="0" w:after="0" w:line="264" w:lineRule="auto"/>
-        <w:ind w:firstLine="480"/>
-      </w:pPr>
-      <w:r>
-        <w:rPr>
-          <w:rFonts w:ascii="Times New Roman" w:hAnsi="Times New Roman" w:eastAsia="宋体"/>
-          <w:b w:val="0"/>
-          <w:sz w:val="24"/>
-        </w:rPr>
-        <w:t>测序质量指标在Q4的检测后判定中可以使用，但在Q3的首次预约中通常未知。将它们直接输入预约模型容易形成时间信息泄漏，因此本文没有以高预测分数为理由引入未来质量信息。若未来能够在预约时预测测序质量，可另建独立质量预测模型并传播其不确定性；本附件现阶段不支持把检测后实测质量作为已知输入。</w:t>
+        <w:t>辅助受孕和孕次是代理变量；测序质量属于检测后信息，不输入Q3预约模型，以避免时间泄漏。当前比较只回答这两个固定规格能否稳定改进预测。</w:t>
       </w:r>
     </w:p>
     <w:p>
@@ -5774,7 +5718,7 @@
           <w:b w:val="0"/>
           <w:sz w:val="24"/>
         </w:rPr>
-        <w:t>这一结果支持在当前数据下保持简洁主线，避免仅因问题列出多个因素就强行堆叠复杂模型。它也提示信息增益可能受样本规模、特征范围、测量误差及目标定义影响。某变量对连续浓度存在统计关系，并不保证能改进4%二元事件预测；某变量在已观测孕妇中有用，也不保证在首次检测的新孕妇中有用。模型比较必须与最终使用条件一致。</w:t>
+        <w:t>因此当前数据支持保持简洁主线；年龄、身高等变量仍可能在更大或不同人群中提供增益，但本实验没有显示稳定改善。</w:t>
       </w:r>
     </w:p>
     <w:p>
@@ -5815,7 +5759,7 @@
           <w:b w:val="0"/>
           <w:sz w:val="24"/>
         </w:rPr>
-        <w:t>表7采用与问题二完全相同的中延迟权重、4%阈值、每日网格和支持约束，展示基础扩展方案。有效三组人数为203、31、33，中间组推荐12周2天。图10展示多因素条件方案与不同风险情景的关系。与表5相比，切点和中间组孕周有所变化，但其变化不能单凭训练风险下降就解释为临床改进，因为外层预测没有显示稳定优势。</w:t>
+        <w:t>表7采用M情景、4%阈值、每日网格和相同支持约束，展示基础扩展方案。有效三组人数为203、31、33，中间组推荐12周2天。图10展示多因素条件方案与L/M/H情景的关系。与表5相比，切点和中间组孕周有所变化；外层预测未显示稳定增益，因此将它作为条件扩展答案而非替代方案。</w:t>
       </w:r>
     </w:p>
     <w:p>
@@ -5985,7 +5929,7 @@
                 <w:b w:val="0"/>
                 <w:sz w:val="20"/>
               </w:rPr>
-              <w:t>[20.7031, 33.4115)</w:t>
+              <w:t>[20.7, 33.4)</w:t>
             </w:r>
           </w:p>
         </w:tc>
@@ -6083,7 +6027,7 @@
                 <w:b w:val="0"/>
                 <w:sz w:val="20"/>
               </w:rPr>
-              <w:t>[33.4115, 35.0003)</w:t>
+              <w:t>[33.4, 35.0)</w:t>
             </w:r>
           </w:p>
         </w:tc>
@@ -6181,7 +6125,7 @@
                 <w:b w:val="0"/>
                 <w:sz w:val="20"/>
               </w:rPr>
-              <w:t>[35.0003, 46.8750]</w:t>
+              <w:t>[35.0, 46.9]</w:t>
             </w:r>
           </w:p>
         </w:tc>
@@ -6324,7 +6268,7 @@
           <w:b w:val="0"/>
           <w:sz w:val="24"/>
         </w:rPr>
-        <w:t>问题三的结论不是必须用多因素替代BMI方案，而是给出一个已明确构造、可检验的扩展解，并说明其增益尚不稳定。若首条年龄、身高信息可靠且希望考虑组内人群差异，可把表7作为条件方案；若强调简洁与解释，表5仍有保留理由。两者均需结合下一节的敏感性分析，而不能选取视觉上更整齐的一组切点作为唯一答案。</w:t>
+        <w:t>问题三给出一个可检验的多因素条件解；在强调简洁和稳定性时，表5仍可作为主方案，表7作为扩展方案。</w:t>
       </w:r>
     </w:p>
     <w:p>
@@ -6557,7 +6501,7 @@
           <w:b w:val="0"/>
           <w:sz w:val="24"/>
         </w:rPr>
-        <w:t>采用重采样的基本思想是从样本经验分布近似研究估计量波动[4]；在当前重复测量情形中，重采样单位选择孕妇而非单条记录，是为了保留个体内相关性。技术重复并不一定具有完全相同的实验条件，因此σₘ更稳妥的名称是“同次抽血组内波动尺度”，而不是仪器纯误差标准差。正文不将这一有限估计推广为整个NIPT系统的精度标准。</w:t>
+        <w:t>重采样单位选择孕妇而非单条记录，以保留个体内相关性；这一主体层面的Bootstrap实现借鉴重采样的基本思想[4]。σₘ应理解为同次抽血组内波动尺度，而非整个NIPT系统的仪器误差标准差。</w:t>
       </w:r>
     </w:p>
     <w:p>
@@ -6725,7 +6669,7 @@
           <w:b w:val="0"/>
           <w:sz w:val="24"/>
         </w:rPr>
-        <w:t>这里c=0仍包含主体重采样，只是不追加测量噪声；它不是完全不变的原始数据。c=1也不是对真实误差作了一次正确校正，而是在现有、已经带误差的观测上额外增加一个估计尺度的扰动。该试验检验方案对额外波动的敏感程度，不能用于估计去误差后的真实达标轨迹。阈值附近的记录容易因扰动翻转标签，远离阈值的记录通常较稳定。</w:t>
+        <w:t>这里c=0仍包含主体重采样，c=1表示在已有观测上追加一个估计尺度的扰动；该试验检验方案敏感性，不是误差校正。</w:t>
       </w:r>
     </w:p>
     <w:p>
@@ -7711,7 +7655,7 @@
           <w:b w:val="0"/>
           <w:sz w:val="24"/>
         </w:rPr>
-        <w:t>即使不追加噪声，主体重采样也能明显改变方案，说明不确定性不仅来自测量误差，还来自样本构成和模型估计。若只扰动预测结果而不重新拟合，可能遗漏这种结构变化；本试验在每轮重新拟合概率模型并重新分组，能够反映切点和共同孕周随数据变化的过程。但支持约束中的主体数在重采样时按抽样槽位计数，不能被误读为新获得了更多独立受试者。</w:t>
+        <w:t>主体重采样本身即可改变方案，说明不确定性还来自样本构成和模型估计；每轮重新拟合并重新分组可以反映这种变化。</w:t>
       </w:r>
     </w:p>
     <w:p>
@@ -7738,7 +7682,7 @@
           <w:b w:val="0"/>
           <w:sz w:val="24"/>
         </w:rPr>
-        <w:t>表9给出低延迟情景λ=0.005、δ=0.10下，Q2在不同阈值的条件结果。3.5%时所有主体合并为12周6天；4%时形成12周6天与25周两组；4.5%时仍为两种孕周，但早组人数降至38，晚组升至229。阈值改动不仅改变失败概率，也改变风险最小点，说明分组结论必须绑定阈值。</w:t>
+        <w:t>表9给出低延迟L（λ=0.005，δ=0.10）下，Q2在不同阈值的条件结果。3.5%时所有主体合并为12周6天；4%时形成12周6天与25周两组；4.5%时仍为两种孕周，但早组人数降至38，晚组升至229。阈值改动不仅改变失败概率，也改变风险最小点，说明分组结论必须绑定阈值。</w:t>
       </w:r>
     </w:p>
     <w:p>
@@ -8106,7 +8050,7 @@
                 <w:b w:val="0"/>
                 <w:sz w:val="20"/>
               </w:rPr>
-              <w:t>33.8471</w:t>
+              <w:t>33.8</w:t>
             </w:r>
           </w:p>
         </w:tc>
@@ -8228,7 +8172,7 @@
                 <w:b w:val="0"/>
                 <w:sz w:val="20"/>
               </w:rPr>
-              <w:t>29.0781</w:t>
+              <w:t>29.1</w:t>
             </w:r>
           </w:p>
         </w:tc>
@@ -8293,21 +8237,7 @@
           <w:b w:val="0"/>
           <w:sz w:val="24"/>
         </w:rPr>
-        <w:t>25周方案出现在较低的每周延迟代价下，说明此时风险函数愿意用等待换取较高的模型达标概率；这不是推荐所有高BMI孕妇等到25周的医学结论。相反，在较高延迟代价下，有效方案趋于单一早期时点。不同外层划分中的中延迟方案可形成2至4个有效组，切点不是稳定的人体分类边界。风险函数没有真实成本标定时，选择一组最符合直觉的权重并称为唯一最优是不恰当的。</w:t>
-      </w:r>
-    </w:p>
-    <w:p>
-      <w:pPr>
-        <w:spacing w:before="0" w:after="0" w:line="264" w:lineRule="auto"/>
-        <w:ind w:firstLine="480"/>
-      </w:pPr>
-      <w:r>
-        <w:rPr>
-          <w:rFonts w:ascii="Times New Roman" w:hAnsi="Times New Roman" w:eastAsia="宋体"/>
-          <w:b w:val="0"/>
-          <w:sz w:val="24"/>
-        </w:rPr>
-        <w:t>综合问题二和问题三，主结果表给出一个可执行的条件答案，敏感性结果说明其可变范围。更可靠的实际决策需要采集复检成本、失败后的等待时间、不同孕周发现异常的效用以及早期独立队列数据，再更新代价函数与校准模型。当前附件能够支持条件优化的计算过程，但不足以消除这些外部决策信息的缺口。</w:t>
+        <w:t>L情景出现25周边界解，H情景则趋向11周，M情景位于两者之间并给出非平凡分组。因此主答案采用M，L/H作为风险权重敏感性对照；BMI切点仍只是样本范围内的条件分割，不是稳定的人体分类边界。实际应用还需补充复检成本、等待损失和独立早孕队列来重新标定风险函数。</w:t>
       </w:r>
     </w:p>
     <w:p>
@@ -8740,7 +8670,7 @@
           <w:b w:val="0"/>
           <w:sz w:val="24"/>
         </w:rPr>
-        <w:t>表10显示T18和总体标记的概率表现优于各自训练折常数率对照，而T21区分能力不足。总体AP为0.3823，Brier为0.08419，ROC-AUC为0.7711；但在训练选择的MCC阈值下，灵敏度只有0.1791。概率排序和某个二元阈值下的临床可用性是不同问题，不能仅凭AUC或AP较高就声称适合高敏感筛查。</w:t>
+        <w:t>表10显示T18和总体标记的概率表现优于常数率对照，而T21区分能力不足。总体AP为0.3823，Brier为0.08419，ROC-AUC为0.7711；MCC阈值下总体灵敏度为0.1791。为回应漏诊优先场景，表12给出训练层灵敏度目标90%的约束阈值方案。</w:t>
       </w:r>
     </w:p>
     <w:p>
@@ -9541,7 +9471,7 @@
           <w:b w:val="0"/>
           <w:sz w:val="24"/>
         </w:rPr>
-        <w:t>表11进一步给出混淆矩阵。总体异常67条阳性记录中只识别出12条，遗漏55条；T21仅识别2条、漏掉11条，同时产生97条假阳性。这些失败结果必须公开。尤其不能用总体任务的较好概率结果掩盖T21的弱表现，也不能把特异度高解释为异常不会被漏掉。</w:t>
+        <w:t>表11给出MCC阈值下的混淆矩阵：总体异常67条阳性记录中识别12条，遗漏55条；T21识别2条，漏掉11条。</w:t>
       </w:r>
     </w:p>
     <w:p>
@@ -10209,19 +10139,6 @@
     </w:tbl>
     <w:p>
       <w:pPr>
-        <w:spacing w:before="0" w:after="0" w:line="300" w:lineRule="auto"/>
-      </w:pPr>
-      <w:r>
-        <w:rPr>
-          <w:rFonts w:ascii="Times New Roman" w:hAnsi="Times New Roman" w:eastAsia="宋体"/>
-          <w:b w:val="0"/>
-          <w:sz w:val="28"/>
-        </w:rPr>
-        <w:t>7.4 校准与不确定性</w:t>
-      </w:r>
-    </w:p>
-    <w:p>
-      <w:pPr>
         <w:spacing w:before="0" w:after="0" w:line="264" w:lineRule="auto"/>
         <w:ind w:firstLine="480"/>
       </w:pPr>
@@ -10231,7 +10148,1069 @@
           <w:b w:val="0"/>
           <w:sz w:val="24"/>
         </w:rPr>
-        <w:t>图12给出总体异常概率的校准分箱。较高概率区间样本较少，例如最高展示箱只有10条记录、9名孕妇，不能因少数箱接近对角线就宣称模型已经充分校准。较低概率区间虽然记录较多，仍需注意同一孕妇多次检测的相关性。校准检查应同时看概率差异和支持人数，不能只看曲线是否平滑。</w:t>
+        <w:t>表12 高灵敏度约束阈值的主体隔离外层结果（训练层目标灵敏度90%）</w:t>
+      </w:r>
+    </w:p>
+    <w:tbl>
+      <w:tblPr>
+        <w:tblW w:type="auto" w:w="0"/>
+        <w:jc w:val="center"/>
+        <w:tblBorders>
+          <w:top w:val="single" w:sz="12" w:space="0" w:color="000000"/>
+          <w:start w:val="nil" w:sz="0" w:space="0" w:color="auto"/>
+          <w:left w:val="nil" w:sz="0" w:space="0" w:color="auto"/>
+          <w:bottom w:val="single" w:sz="12" w:space="0" w:color="000000"/>
+          <w:end w:val="nil" w:sz="0" w:space="0" w:color="auto"/>
+          <w:right w:val="nil" w:sz="0" w:space="0" w:color="auto"/>
+          <w:insideH w:val="nil" w:sz="0" w:space="0" w:color="auto"/>
+          <w:insideV w:val="nil" w:sz="0" w:space="0" w:color="auto"/>
+        </w:tblBorders>
+        <w:tblLook w:firstColumn="1" w:firstRow="1" w:lastColumn="0" w:lastRow="0" w:noHBand="0" w:noVBand="1" w:val="04A0"/>
+      </w:tblPr>
+      <w:tblGrid>
+        <w:gridCol w:w="1134"/>
+        <w:gridCol w:w="1134"/>
+        <w:gridCol w:w="1134"/>
+        <w:gridCol w:w="1134"/>
+        <w:gridCol w:w="1134"/>
+        <w:gridCol w:w="1134"/>
+        <w:gridCol w:w="1134"/>
+        <w:gridCol w:w="1134"/>
+      </w:tblGrid>
+      <w:tr>
+        <w:tc>
+          <w:tcPr>
+            <w:tcW w:type="dxa" w:w="1134"/>
+            <w:tcBorders>
+              <w:bottom w:val="single" w:sz="4" w:space="0" w:color="000000"/>
+            </w:tcBorders>
+          </w:tcPr>
+          <w:p>
+            <w:pPr>
+              <w:spacing w:line="240" w:lineRule="auto"/>
+              <w:jc w:val="center"/>
+            </w:pPr>
+            <w:r>
+              <w:rPr>
+                <w:sz w:val="20"/>
+              </w:rPr>
+            </w:r>
+            <w:r>
+              <w:rPr>
+                <w:rFonts w:ascii="Times New Roman" w:hAnsi="Times New Roman" w:eastAsia="宋体"/>
+                <w:b/>
+                <w:sz w:val="20"/>
+              </w:rPr>
+              <w:t>目标</w:t>
+            </w:r>
+          </w:p>
+        </w:tc>
+        <w:tc>
+          <w:tcPr>
+            <w:tcW w:type="dxa" w:w="1134"/>
+            <w:tcBorders>
+              <w:bottom w:val="single" w:sz="4" w:space="0" w:color="000000"/>
+            </w:tcBorders>
+          </w:tcPr>
+          <w:p>
+            <w:pPr>
+              <w:spacing w:line="240" w:lineRule="auto"/>
+              <w:jc w:val="center"/>
+            </w:pPr>
+            <w:r>
+              <w:rPr>
+                <w:sz w:val="20"/>
+              </w:rPr>
+            </w:r>
+            <w:r>
+              <w:rPr>
+                <w:rFonts w:ascii="Times New Roman" w:hAnsi="Times New Roman" w:eastAsia="宋体"/>
+                <w:b/>
+                <w:sz w:val="20"/>
+              </w:rPr>
+              <w:t>阈值中位数</w:t>
+            </w:r>
+          </w:p>
+        </w:tc>
+        <w:tc>
+          <w:tcPr>
+            <w:tcW w:type="dxa" w:w="1134"/>
+            <w:tcBorders>
+              <w:bottom w:val="single" w:sz="4" w:space="0" w:color="000000"/>
+            </w:tcBorders>
+          </w:tcPr>
+          <w:p>
+            <w:pPr>
+              <w:spacing w:line="240" w:lineRule="auto"/>
+              <w:jc w:val="center"/>
+            </w:pPr>
+            <w:r>
+              <w:rPr>
+                <w:sz w:val="20"/>
+              </w:rPr>
+            </w:r>
+            <w:r>
+              <w:rPr>
+                <w:rFonts w:ascii="Times New Roman" w:hAnsi="Times New Roman" w:eastAsia="宋体"/>
+                <w:b/>
+                <w:sz w:val="20"/>
+              </w:rPr>
+              <w:t>实际灵敏度</w:t>
+            </w:r>
+          </w:p>
+        </w:tc>
+        <w:tc>
+          <w:tcPr>
+            <w:tcW w:type="dxa" w:w="1134"/>
+            <w:tcBorders>
+              <w:bottom w:val="single" w:sz="4" w:space="0" w:color="000000"/>
+            </w:tcBorders>
+          </w:tcPr>
+          <w:p>
+            <w:pPr>
+              <w:spacing w:line="240" w:lineRule="auto"/>
+              <w:jc w:val="center"/>
+            </w:pPr>
+            <w:r>
+              <w:rPr>
+                <w:sz w:val="20"/>
+              </w:rPr>
+            </w:r>
+            <w:r>
+              <w:rPr>
+                <w:rFonts w:ascii="Times New Roman" w:hAnsi="Times New Roman" w:eastAsia="宋体"/>
+                <w:b/>
+                <w:sz w:val="20"/>
+              </w:rPr>
+              <w:t>特异度</w:t>
+            </w:r>
+          </w:p>
+        </w:tc>
+        <w:tc>
+          <w:tcPr>
+            <w:tcW w:type="dxa" w:w="1134"/>
+            <w:tcBorders>
+              <w:bottom w:val="single" w:sz="4" w:space="0" w:color="000000"/>
+            </w:tcBorders>
+          </w:tcPr>
+          <w:p>
+            <w:pPr>
+              <w:spacing w:line="240" w:lineRule="auto"/>
+              <w:jc w:val="center"/>
+            </w:pPr>
+            <w:r>
+              <w:rPr>
+                <w:sz w:val="20"/>
+              </w:rPr>
+            </w:r>
+            <w:r>
+              <w:rPr>
+                <w:rFonts w:ascii="Times New Roman" w:hAnsi="Times New Roman" w:eastAsia="宋体"/>
+                <w:b/>
+                <w:sz w:val="20"/>
+              </w:rPr>
+              <w:t>TP</w:t>
+            </w:r>
+          </w:p>
+        </w:tc>
+        <w:tc>
+          <w:tcPr>
+            <w:tcW w:type="dxa" w:w="1134"/>
+            <w:tcBorders>
+              <w:bottom w:val="single" w:sz="4" w:space="0" w:color="000000"/>
+            </w:tcBorders>
+          </w:tcPr>
+          <w:p>
+            <w:pPr>
+              <w:spacing w:line="240" w:lineRule="auto"/>
+              <w:jc w:val="center"/>
+            </w:pPr>
+            <w:r>
+              <w:rPr>
+                <w:sz w:val="20"/>
+              </w:rPr>
+            </w:r>
+            <w:r>
+              <w:rPr>
+                <w:rFonts w:ascii="Times New Roman" w:hAnsi="Times New Roman" w:eastAsia="宋体"/>
+                <w:b/>
+                <w:sz w:val="20"/>
+              </w:rPr>
+              <w:t>FP</w:t>
+            </w:r>
+          </w:p>
+        </w:tc>
+        <w:tc>
+          <w:tcPr>
+            <w:tcW w:type="dxa" w:w="1134"/>
+            <w:tcBorders>
+              <w:bottom w:val="single" w:sz="4" w:space="0" w:color="000000"/>
+            </w:tcBorders>
+          </w:tcPr>
+          <w:p>
+            <w:pPr>
+              <w:spacing w:line="240" w:lineRule="auto"/>
+              <w:jc w:val="center"/>
+            </w:pPr>
+            <w:r>
+              <w:rPr>
+                <w:sz w:val="20"/>
+              </w:rPr>
+            </w:r>
+            <w:r>
+              <w:rPr>
+                <w:rFonts w:ascii="Times New Roman" w:hAnsi="Times New Roman" w:eastAsia="宋体"/>
+                <w:b/>
+                <w:sz w:val="20"/>
+              </w:rPr>
+              <w:t>FN</w:t>
+            </w:r>
+          </w:p>
+        </w:tc>
+        <w:tc>
+          <w:tcPr>
+            <w:tcW w:type="dxa" w:w="1134"/>
+            <w:tcBorders>
+              <w:bottom w:val="single" w:sz="4" w:space="0" w:color="000000"/>
+            </w:tcBorders>
+          </w:tcPr>
+          <w:p>
+            <w:pPr>
+              <w:spacing w:line="240" w:lineRule="auto"/>
+              <w:jc w:val="center"/>
+            </w:pPr>
+            <w:r>
+              <w:rPr>
+                <w:sz w:val="20"/>
+              </w:rPr>
+            </w:r>
+            <w:r>
+              <w:rPr>
+                <w:rFonts w:ascii="Times New Roman" w:hAnsi="Times New Roman" w:eastAsia="宋体"/>
+                <w:b/>
+                <w:sz w:val="20"/>
+              </w:rPr>
+              <w:t>TN</w:t>
+            </w:r>
+          </w:p>
+        </w:tc>
+      </w:tr>
+      <w:tr>
+        <w:tc>
+          <w:tcPr>
+            <w:tcW w:type="dxa" w:w="1134"/>
+          </w:tcPr>
+          <w:p>
+            <w:pPr>
+              <w:spacing w:line="240" w:lineRule="auto"/>
+              <w:jc w:val="center"/>
+            </w:pPr>
+            <w:r>
+              <w:rPr>
+                <w:sz w:val="20"/>
+              </w:rPr>
+            </w:r>
+            <w:r>
+              <w:rPr>
+                <w:rFonts w:ascii="Times New Roman" w:hAnsi="Times New Roman" w:eastAsia="宋体"/>
+                <w:b w:val="0"/>
+                <w:sz w:val="20"/>
+              </w:rPr>
+              <w:t>T13</w:t>
+            </w:r>
+          </w:p>
+        </w:tc>
+        <w:tc>
+          <w:tcPr>
+            <w:tcW w:type="dxa" w:w="1134"/>
+          </w:tcPr>
+          <w:p>
+            <w:pPr>
+              <w:spacing w:line="240" w:lineRule="auto"/>
+              <w:jc w:val="center"/>
+            </w:pPr>
+            <w:r>
+              <w:rPr>
+                <w:sz w:val="20"/>
+              </w:rPr>
+            </w:r>
+            <w:r>
+              <w:rPr>
+                <w:rFonts w:ascii="Times New Roman" w:hAnsi="Times New Roman" w:eastAsia="宋体"/>
+                <w:b w:val="0"/>
+                <w:sz w:val="20"/>
+              </w:rPr>
+              <w:t>0.0199</w:t>
+            </w:r>
+          </w:p>
+        </w:tc>
+        <w:tc>
+          <w:tcPr>
+            <w:tcW w:type="dxa" w:w="1134"/>
+          </w:tcPr>
+          <w:p>
+            <w:pPr>
+              <w:spacing w:line="240" w:lineRule="auto"/>
+              <w:jc w:val="center"/>
+            </w:pPr>
+            <w:r>
+              <w:rPr>
+                <w:sz w:val="20"/>
+              </w:rPr>
+            </w:r>
+            <w:r>
+              <w:rPr>
+                <w:rFonts w:ascii="Times New Roman" w:hAnsi="Times New Roman" w:eastAsia="宋体"/>
+                <w:b w:val="0"/>
+                <w:sz w:val="20"/>
+              </w:rPr>
+              <w:t>0.9130</w:t>
+            </w:r>
+          </w:p>
+        </w:tc>
+        <w:tc>
+          <w:tcPr>
+            <w:tcW w:type="dxa" w:w="1134"/>
+          </w:tcPr>
+          <w:p>
+            <w:pPr>
+              <w:spacing w:line="240" w:lineRule="auto"/>
+              <w:jc w:val="center"/>
+            </w:pPr>
+            <w:r>
+              <w:rPr>
+                <w:sz w:val="20"/>
+              </w:rPr>
+            </w:r>
+            <w:r>
+              <w:rPr>
+                <w:rFonts w:ascii="Times New Roman" w:hAnsi="Times New Roman" w:eastAsia="宋体"/>
+                <w:b w:val="0"/>
+                <w:sz w:val="20"/>
+              </w:rPr>
+              <w:t>0.2612</w:t>
+            </w:r>
+          </w:p>
+        </w:tc>
+        <w:tc>
+          <w:tcPr>
+            <w:tcW w:type="dxa" w:w="1134"/>
+          </w:tcPr>
+          <w:p>
+            <w:pPr>
+              <w:spacing w:line="240" w:lineRule="auto"/>
+              <w:jc w:val="center"/>
+            </w:pPr>
+            <w:r>
+              <w:rPr>
+                <w:sz w:val="20"/>
+              </w:rPr>
+            </w:r>
+            <w:r>
+              <w:rPr>
+                <w:rFonts w:ascii="Times New Roman" w:hAnsi="Times New Roman" w:eastAsia="宋体"/>
+                <w:b w:val="0"/>
+                <w:sz w:val="20"/>
+              </w:rPr>
+              <w:t>21</w:t>
+            </w:r>
+          </w:p>
+        </w:tc>
+        <w:tc>
+          <w:tcPr>
+            <w:tcW w:type="dxa" w:w="1134"/>
+          </w:tcPr>
+          <w:p>
+            <w:pPr>
+              <w:spacing w:line="240" w:lineRule="auto"/>
+              <w:jc w:val="center"/>
+            </w:pPr>
+            <w:r>
+              <w:rPr>
+                <w:sz w:val="20"/>
+              </w:rPr>
+            </w:r>
+            <w:r>
+              <w:rPr>
+                <w:rFonts w:ascii="Times New Roman" w:hAnsi="Times New Roman" w:eastAsia="宋体"/>
+                <w:b w:val="0"/>
+                <w:sz w:val="20"/>
+              </w:rPr>
+              <w:t>430</w:t>
+            </w:r>
+          </w:p>
+        </w:tc>
+        <w:tc>
+          <w:tcPr>
+            <w:tcW w:type="dxa" w:w="1134"/>
+          </w:tcPr>
+          <w:p>
+            <w:pPr>
+              <w:spacing w:line="240" w:lineRule="auto"/>
+              <w:jc w:val="center"/>
+            </w:pPr>
+            <w:r>
+              <w:rPr>
+                <w:sz w:val="20"/>
+              </w:rPr>
+            </w:r>
+            <w:r>
+              <w:rPr>
+                <w:rFonts w:ascii="Times New Roman" w:hAnsi="Times New Roman" w:eastAsia="宋体"/>
+                <w:b w:val="0"/>
+                <w:sz w:val="20"/>
+              </w:rPr>
+              <w:t>2</w:t>
+            </w:r>
+          </w:p>
+        </w:tc>
+        <w:tc>
+          <w:tcPr>
+            <w:tcW w:type="dxa" w:w="1134"/>
+          </w:tcPr>
+          <w:p>
+            <w:pPr>
+              <w:spacing w:line="240" w:lineRule="auto"/>
+              <w:jc w:val="center"/>
+            </w:pPr>
+            <w:r>
+              <w:rPr>
+                <w:sz w:val="20"/>
+              </w:rPr>
+            </w:r>
+            <w:r>
+              <w:rPr>
+                <w:rFonts w:ascii="Times New Roman" w:hAnsi="Times New Roman" w:eastAsia="宋体"/>
+                <w:b w:val="0"/>
+                <w:sz w:val="20"/>
+              </w:rPr>
+              <w:t>152</w:t>
+            </w:r>
+          </w:p>
+        </w:tc>
+      </w:tr>
+      <w:tr>
+        <w:tc>
+          <w:tcPr>
+            <w:tcW w:type="dxa" w:w="1134"/>
+          </w:tcPr>
+          <w:p>
+            <w:pPr>
+              <w:spacing w:line="240" w:lineRule="auto"/>
+              <w:jc w:val="center"/>
+            </w:pPr>
+            <w:r>
+              <w:rPr>
+                <w:sz w:val="20"/>
+              </w:rPr>
+            </w:r>
+            <w:r>
+              <w:rPr>
+                <w:rFonts w:ascii="Times New Roman" w:hAnsi="Times New Roman" w:eastAsia="宋体"/>
+                <w:b w:val="0"/>
+                <w:sz w:val="20"/>
+              </w:rPr>
+              <w:t>T18</w:t>
+            </w:r>
+          </w:p>
+        </w:tc>
+        <w:tc>
+          <w:tcPr>
+            <w:tcW w:type="dxa" w:w="1134"/>
+          </w:tcPr>
+          <w:p>
+            <w:pPr>
+              <w:spacing w:line="240" w:lineRule="auto"/>
+              <w:jc w:val="center"/>
+            </w:pPr>
+            <w:r>
+              <w:rPr>
+                <w:sz w:val="20"/>
+              </w:rPr>
+            </w:r>
+            <w:r>
+              <w:rPr>
+                <w:rFonts w:ascii="Times New Roman" w:hAnsi="Times New Roman" w:eastAsia="宋体"/>
+                <w:b w:val="0"/>
+                <w:sz w:val="20"/>
+              </w:rPr>
+              <w:t>0.0605</w:t>
+            </w:r>
+          </w:p>
+        </w:tc>
+        <w:tc>
+          <w:tcPr>
+            <w:tcW w:type="dxa" w:w="1134"/>
+          </w:tcPr>
+          <w:p>
+            <w:pPr>
+              <w:spacing w:line="240" w:lineRule="auto"/>
+              <w:jc w:val="center"/>
+            </w:pPr>
+            <w:r>
+              <w:rPr>
+                <w:sz w:val="20"/>
+              </w:rPr>
+            </w:r>
+            <w:r>
+              <w:rPr>
+                <w:rFonts w:ascii="Times New Roman" w:hAnsi="Times New Roman" w:eastAsia="宋体"/>
+                <w:b w:val="0"/>
+                <w:sz w:val="20"/>
+              </w:rPr>
+              <w:t>0.8478</w:t>
+            </w:r>
+          </w:p>
+        </w:tc>
+        <w:tc>
+          <w:tcPr>
+            <w:tcW w:type="dxa" w:w="1134"/>
+          </w:tcPr>
+          <w:p>
+            <w:pPr>
+              <w:spacing w:line="240" w:lineRule="auto"/>
+              <w:jc w:val="center"/>
+            </w:pPr>
+            <w:r>
+              <w:rPr>
+                <w:sz w:val="20"/>
+              </w:rPr>
+            </w:r>
+            <w:r>
+              <w:rPr>
+                <w:rFonts w:ascii="Times New Roman" w:hAnsi="Times New Roman" w:eastAsia="宋体"/>
+                <w:b w:val="0"/>
+                <w:sz w:val="20"/>
+              </w:rPr>
+              <w:t>0.6315</w:t>
+            </w:r>
+          </w:p>
+        </w:tc>
+        <w:tc>
+          <w:tcPr>
+            <w:tcW w:type="dxa" w:w="1134"/>
+          </w:tcPr>
+          <w:p>
+            <w:pPr>
+              <w:spacing w:line="240" w:lineRule="auto"/>
+              <w:jc w:val="center"/>
+            </w:pPr>
+            <w:r>
+              <w:rPr>
+                <w:sz w:val="20"/>
+              </w:rPr>
+            </w:r>
+            <w:r>
+              <w:rPr>
+                <w:rFonts w:ascii="Times New Roman" w:hAnsi="Times New Roman" w:eastAsia="宋体"/>
+                <w:b w:val="0"/>
+                <w:sz w:val="20"/>
+              </w:rPr>
+              <w:t>39</w:t>
+            </w:r>
+          </w:p>
+        </w:tc>
+        <w:tc>
+          <w:tcPr>
+            <w:tcW w:type="dxa" w:w="1134"/>
+          </w:tcPr>
+          <w:p>
+            <w:pPr>
+              <w:spacing w:line="240" w:lineRule="auto"/>
+              <w:jc w:val="center"/>
+            </w:pPr>
+            <w:r>
+              <w:rPr>
+                <w:sz w:val="20"/>
+              </w:rPr>
+            </w:r>
+            <w:r>
+              <w:rPr>
+                <w:rFonts w:ascii="Times New Roman" w:hAnsi="Times New Roman" w:eastAsia="宋体"/>
+                <w:b w:val="0"/>
+                <w:sz w:val="20"/>
+              </w:rPr>
+              <w:t>206</w:t>
+            </w:r>
+          </w:p>
+        </w:tc>
+        <w:tc>
+          <w:tcPr>
+            <w:tcW w:type="dxa" w:w="1134"/>
+          </w:tcPr>
+          <w:p>
+            <w:pPr>
+              <w:spacing w:line="240" w:lineRule="auto"/>
+              <w:jc w:val="center"/>
+            </w:pPr>
+            <w:r>
+              <w:rPr>
+                <w:sz w:val="20"/>
+              </w:rPr>
+            </w:r>
+            <w:r>
+              <w:rPr>
+                <w:rFonts w:ascii="Times New Roman" w:hAnsi="Times New Roman" w:eastAsia="宋体"/>
+                <w:b w:val="0"/>
+                <w:sz w:val="20"/>
+              </w:rPr>
+              <w:t>7</w:t>
+            </w:r>
+          </w:p>
+        </w:tc>
+        <w:tc>
+          <w:tcPr>
+            <w:tcW w:type="dxa" w:w="1134"/>
+          </w:tcPr>
+          <w:p>
+            <w:pPr>
+              <w:spacing w:line="240" w:lineRule="auto"/>
+              <w:jc w:val="center"/>
+            </w:pPr>
+            <w:r>
+              <w:rPr>
+                <w:sz w:val="20"/>
+              </w:rPr>
+            </w:r>
+            <w:r>
+              <w:rPr>
+                <w:rFonts w:ascii="Times New Roman" w:hAnsi="Times New Roman" w:eastAsia="宋体"/>
+                <w:b w:val="0"/>
+                <w:sz w:val="20"/>
+              </w:rPr>
+              <w:t>353</w:t>
+            </w:r>
+          </w:p>
+        </w:tc>
+      </w:tr>
+      <w:tr>
+        <w:tc>
+          <w:tcPr>
+            <w:tcW w:type="dxa" w:w="1134"/>
+          </w:tcPr>
+          <w:p>
+            <w:pPr>
+              <w:spacing w:line="240" w:lineRule="auto"/>
+              <w:jc w:val="center"/>
+            </w:pPr>
+            <w:r>
+              <w:rPr>
+                <w:sz w:val="20"/>
+              </w:rPr>
+            </w:r>
+            <w:r>
+              <w:rPr>
+                <w:rFonts w:ascii="Times New Roman" w:hAnsi="Times New Roman" w:eastAsia="宋体"/>
+                <w:b w:val="0"/>
+                <w:sz w:val="20"/>
+              </w:rPr>
+              <w:t>T21</w:t>
+            </w:r>
+          </w:p>
+        </w:tc>
+        <w:tc>
+          <w:tcPr>
+            <w:tcW w:type="dxa" w:w="1134"/>
+          </w:tcPr>
+          <w:p>
+            <w:pPr>
+              <w:spacing w:line="240" w:lineRule="auto"/>
+              <w:jc w:val="center"/>
+            </w:pPr>
+            <w:r>
+              <w:rPr>
+                <w:sz w:val="20"/>
+              </w:rPr>
+            </w:r>
+            <w:r>
+              <w:rPr>
+                <w:rFonts w:ascii="Times New Roman" w:hAnsi="Times New Roman" w:eastAsia="宋体"/>
+                <w:b w:val="0"/>
+                <w:sz w:val="20"/>
+              </w:rPr>
+              <w:t>0.0058</w:t>
+            </w:r>
+          </w:p>
+        </w:tc>
+        <w:tc>
+          <w:tcPr>
+            <w:tcW w:type="dxa" w:w="1134"/>
+          </w:tcPr>
+          <w:p>
+            <w:pPr>
+              <w:spacing w:line="240" w:lineRule="auto"/>
+              <w:jc w:val="center"/>
+            </w:pPr>
+            <w:r>
+              <w:rPr>
+                <w:sz w:val="20"/>
+              </w:rPr>
+            </w:r>
+            <w:r>
+              <w:rPr>
+                <w:rFonts w:ascii="Times New Roman" w:hAnsi="Times New Roman" w:eastAsia="宋体"/>
+                <w:b w:val="0"/>
+                <w:sz w:val="20"/>
+              </w:rPr>
+              <w:t>0.8462</w:t>
+            </w:r>
+          </w:p>
+        </w:tc>
+        <w:tc>
+          <w:tcPr>
+            <w:tcW w:type="dxa" w:w="1134"/>
+          </w:tcPr>
+          <w:p>
+            <w:pPr>
+              <w:spacing w:line="240" w:lineRule="auto"/>
+              <w:jc w:val="center"/>
+            </w:pPr>
+            <w:r>
+              <w:rPr>
+                <w:sz w:val="20"/>
+              </w:rPr>
+            </w:r>
+            <w:r>
+              <w:rPr>
+                <w:rFonts w:ascii="Times New Roman" w:hAnsi="Times New Roman" w:eastAsia="宋体"/>
+                <w:b w:val="0"/>
+                <w:sz w:val="20"/>
+              </w:rPr>
+              <w:t>0.0726</w:t>
+            </w:r>
+          </w:p>
+        </w:tc>
+        <w:tc>
+          <w:tcPr>
+            <w:tcW w:type="dxa" w:w="1134"/>
+          </w:tcPr>
+          <w:p>
+            <w:pPr>
+              <w:spacing w:line="240" w:lineRule="auto"/>
+              <w:jc w:val="center"/>
+            </w:pPr>
+            <w:r>
+              <w:rPr>
+                <w:sz w:val="20"/>
+              </w:rPr>
+            </w:r>
+            <w:r>
+              <w:rPr>
+                <w:rFonts w:ascii="Times New Roman" w:hAnsi="Times New Roman" w:eastAsia="宋体"/>
+                <w:b w:val="0"/>
+                <w:sz w:val="20"/>
+              </w:rPr>
+              <w:t>11</w:t>
+            </w:r>
+          </w:p>
+        </w:tc>
+        <w:tc>
+          <w:tcPr>
+            <w:tcW w:type="dxa" w:w="1134"/>
+          </w:tcPr>
+          <w:p>
+            <w:pPr>
+              <w:spacing w:line="240" w:lineRule="auto"/>
+              <w:jc w:val="center"/>
+            </w:pPr>
+            <w:r>
+              <w:rPr>
+                <w:sz w:val="20"/>
+              </w:rPr>
+            </w:r>
+            <w:r>
+              <w:rPr>
+                <w:rFonts w:ascii="Times New Roman" w:hAnsi="Times New Roman" w:eastAsia="宋体"/>
+                <w:b w:val="0"/>
+                <w:sz w:val="20"/>
+              </w:rPr>
+              <w:t>549</w:t>
+            </w:r>
+          </w:p>
+        </w:tc>
+        <w:tc>
+          <w:tcPr>
+            <w:tcW w:type="dxa" w:w="1134"/>
+          </w:tcPr>
+          <w:p>
+            <w:pPr>
+              <w:spacing w:line="240" w:lineRule="auto"/>
+              <w:jc w:val="center"/>
+            </w:pPr>
+            <w:r>
+              <w:rPr>
+                <w:sz w:val="20"/>
+              </w:rPr>
+            </w:r>
+            <w:r>
+              <w:rPr>
+                <w:rFonts w:ascii="Times New Roman" w:hAnsi="Times New Roman" w:eastAsia="宋体"/>
+                <w:b w:val="0"/>
+                <w:sz w:val="20"/>
+              </w:rPr>
+              <w:t>2</w:t>
+            </w:r>
+          </w:p>
+        </w:tc>
+        <w:tc>
+          <w:tcPr>
+            <w:tcW w:type="dxa" w:w="1134"/>
+          </w:tcPr>
+          <w:p>
+            <w:pPr>
+              <w:spacing w:line="240" w:lineRule="auto"/>
+              <w:jc w:val="center"/>
+            </w:pPr>
+            <w:r>
+              <w:rPr>
+                <w:sz w:val="20"/>
+              </w:rPr>
+            </w:r>
+            <w:r>
+              <w:rPr>
+                <w:rFonts w:ascii="Times New Roman" w:hAnsi="Times New Roman" w:eastAsia="宋体"/>
+                <w:b w:val="0"/>
+                <w:sz w:val="20"/>
+              </w:rPr>
+              <w:t>43</w:t>
+            </w:r>
+          </w:p>
+        </w:tc>
+      </w:tr>
+      <w:tr>
+        <w:tc>
+          <w:tcPr>
+            <w:tcW w:type="dxa" w:w="1134"/>
+          </w:tcPr>
+          <w:p>
+            <w:pPr>
+              <w:spacing w:line="240" w:lineRule="auto"/>
+              <w:jc w:val="center"/>
+            </w:pPr>
+            <w:r>
+              <w:rPr>
+                <w:sz w:val="20"/>
+              </w:rPr>
+            </w:r>
+            <w:r>
+              <w:rPr>
+                <w:rFonts w:ascii="Times New Roman" w:hAnsi="Times New Roman" w:eastAsia="宋体"/>
+                <w:b w:val="0"/>
+                <w:sz w:val="20"/>
+              </w:rPr>
+              <w:t>任一异常标记</w:t>
+            </w:r>
+          </w:p>
+        </w:tc>
+        <w:tc>
+          <w:tcPr>
+            <w:tcW w:type="dxa" w:w="1134"/>
+          </w:tcPr>
+          <w:p>
+            <w:pPr>
+              <w:spacing w:line="240" w:lineRule="auto"/>
+              <w:jc w:val="center"/>
+            </w:pPr>
+            <w:r>
+              <w:rPr>
+                <w:sz w:val="20"/>
+              </w:rPr>
+            </w:r>
+            <w:r>
+              <w:rPr>
+                <w:rFonts w:ascii="Times New Roman" w:hAnsi="Times New Roman" w:eastAsia="宋体"/>
+                <w:b w:val="0"/>
+                <w:sz w:val="20"/>
+              </w:rPr>
+              <w:t>0.0562</w:t>
+            </w:r>
+          </w:p>
+        </w:tc>
+        <w:tc>
+          <w:tcPr>
+            <w:tcW w:type="dxa" w:w="1134"/>
+          </w:tcPr>
+          <w:p>
+            <w:pPr>
+              <w:spacing w:line="240" w:lineRule="auto"/>
+              <w:jc w:val="center"/>
+            </w:pPr>
+            <w:r>
+              <w:rPr>
+                <w:sz w:val="20"/>
+              </w:rPr>
+            </w:r>
+            <w:r>
+              <w:rPr>
+                <w:rFonts w:ascii="Times New Roman" w:hAnsi="Times New Roman" w:eastAsia="宋体"/>
+                <w:b w:val="0"/>
+                <w:sz w:val="20"/>
+              </w:rPr>
+              <w:t>0.8955</w:t>
+            </w:r>
+          </w:p>
+        </w:tc>
+        <w:tc>
+          <w:tcPr>
+            <w:tcW w:type="dxa" w:w="1134"/>
+          </w:tcPr>
+          <w:p>
+            <w:pPr>
+              <w:spacing w:line="240" w:lineRule="auto"/>
+              <w:jc w:val="center"/>
+            </w:pPr>
+            <w:r>
+              <w:rPr>
+                <w:sz w:val="20"/>
+              </w:rPr>
+            </w:r>
+            <w:r>
+              <w:rPr>
+                <w:rFonts w:ascii="Times New Roman" w:hAnsi="Times New Roman" w:eastAsia="宋体"/>
+                <w:b w:val="0"/>
+                <w:sz w:val="20"/>
+              </w:rPr>
+              <w:t>0.4033</w:t>
+            </w:r>
+          </w:p>
+        </w:tc>
+        <w:tc>
+          <w:tcPr>
+            <w:tcW w:type="dxa" w:w="1134"/>
+          </w:tcPr>
+          <w:p>
+            <w:pPr>
+              <w:spacing w:line="240" w:lineRule="auto"/>
+              <w:jc w:val="center"/>
+            </w:pPr>
+            <w:r>
+              <w:rPr>
+                <w:sz w:val="20"/>
+              </w:rPr>
+            </w:r>
+            <w:r>
+              <w:rPr>
+                <w:rFonts w:ascii="Times New Roman" w:hAnsi="Times New Roman" w:eastAsia="宋体"/>
+                <w:b w:val="0"/>
+                <w:sz w:val="20"/>
+              </w:rPr>
+              <w:t>60</w:t>
+            </w:r>
+          </w:p>
+        </w:tc>
+        <w:tc>
+          <w:tcPr>
+            <w:tcW w:type="dxa" w:w="1134"/>
+          </w:tcPr>
+          <w:p>
+            <w:pPr>
+              <w:spacing w:line="240" w:lineRule="auto"/>
+              <w:jc w:val="center"/>
+            </w:pPr>
+            <w:r>
+              <w:rPr>
+                <w:sz w:val="20"/>
+              </w:rPr>
+            </w:r>
+            <w:r>
+              <w:rPr>
+                <w:rFonts w:ascii="Times New Roman" w:hAnsi="Times New Roman" w:eastAsia="宋体"/>
+                <w:b w:val="0"/>
+                <w:sz w:val="20"/>
+              </w:rPr>
+              <w:t>321</w:t>
+            </w:r>
+          </w:p>
+        </w:tc>
+        <w:tc>
+          <w:tcPr>
+            <w:tcW w:type="dxa" w:w="1134"/>
+          </w:tcPr>
+          <w:p>
+            <w:pPr>
+              <w:spacing w:line="240" w:lineRule="auto"/>
+              <w:jc w:val="center"/>
+            </w:pPr>
+            <w:r>
+              <w:rPr>
+                <w:sz w:val="20"/>
+              </w:rPr>
+            </w:r>
+            <w:r>
+              <w:rPr>
+                <w:rFonts w:ascii="Times New Roman" w:hAnsi="Times New Roman" w:eastAsia="宋体"/>
+                <w:b w:val="0"/>
+                <w:sz w:val="20"/>
+              </w:rPr>
+              <w:t>7</w:t>
+            </w:r>
+          </w:p>
+        </w:tc>
+        <w:tc>
+          <w:tcPr>
+            <w:tcW w:type="dxa" w:w="1134"/>
+          </w:tcPr>
+          <w:p>
+            <w:pPr>
+              <w:spacing w:line="240" w:lineRule="auto"/>
+              <w:jc w:val="center"/>
+            </w:pPr>
+            <w:r>
+              <w:rPr>
+                <w:sz w:val="20"/>
+              </w:rPr>
+            </w:r>
+            <w:r>
+              <w:rPr>
+                <w:rFonts w:ascii="Times New Roman" w:hAnsi="Times New Roman" w:eastAsia="宋体"/>
+                <w:b w:val="0"/>
+                <w:sz w:val="20"/>
+              </w:rPr>
+              <w:t>217</w:t>
+            </w:r>
+          </w:p>
+        </w:tc>
+      </w:tr>
+    </w:tbl>
+    <w:p>
+      <w:pPr>
+        <w:spacing w:before="0" w:after="0" w:line="264" w:lineRule="auto"/>
+        <w:ind w:firstLine="480"/>
+      </w:pPr>
+      <w:r>
+        <w:rPr>
+          <w:rFonts w:ascii="Times New Roman" w:hAnsi="Times New Roman" w:eastAsia="宋体"/>
+          <w:b w:val="0"/>
+          <w:sz w:val="24"/>
+        </w:rPr>
+        <w:t>该方案的阈值只由每个外层训练集内部的主体交叉验证选择，外层结果用于检验约束能否推广。总体实际灵敏度接近90%，但特异度从MCC方案的0.9851降至0.4033；T21的外层灵敏度也未达到训练目标，说明高灵敏度约束会显著增加假阳性，且不能保证小样本类别在新主体上满足目标。</w:t>
+      </w:r>
+    </w:p>
+    <w:p>
+      <w:pPr>
+        <w:spacing w:before="0" w:after="0" w:line="300" w:lineRule="auto"/>
+      </w:pPr>
+      <w:r>
+        <w:rPr>
+          <w:rFonts w:ascii="Times New Roman" w:hAnsi="Times New Roman" w:eastAsia="宋体"/>
+          <w:b w:val="0"/>
+          <w:sz w:val="28"/>
+        </w:rPr>
+        <w:t>7.4 校准与不确定性</w:t>
+      </w:r>
+    </w:p>
+    <w:p>
+      <w:pPr>
+        <w:spacing w:before="0" w:after="0" w:line="264" w:lineRule="auto"/>
+        <w:ind w:firstLine="480"/>
+      </w:pPr>
+      <w:r>
+        <w:rPr>
+          <w:rFonts w:ascii="Times New Roman" w:hAnsi="Times New Roman" w:eastAsia="宋体"/>
+          <w:b w:val="0"/>
+          <w:sz w:val="24"/>
+        </w:rPr>
+        <w:t>图12给出总体异常概率的校准分箱；最高概率箱仅10条记录，解读需结合支持人数。</w:t>
       </w:r>
     </w:p>
     <w:p>
@@ -10299,7 +11278,7 @@
           <w:b w:val="0"/>
           <w:sz w:val="24"/>
         </w:rPr>
-        <w:t>对147名孕妇的固定外层平均损失进行2000次配对重采样，得到模型相对常数率对照的主体Brier差值区间，结果见图13和表12。T18差值约−0.00929，区间−0.01685至−0.00294；总体差值约−0.01527，区间−0.02575至−0.00663；T13与T21区间跨零。这些区间支持当前预测下的相对比较，但不包含重新训练、重新分折或目标选择的不确定性。</w:t>
+        <w:t>对147名孕妇的固定外层平均损失进行2000次配对重采样，得到模型相对常数率对照的主体Brier差值区间，结果见图13和表13。T18差值约−0.00929，区间−0.01685至−0.00294；总体差值约−0.01527，区间−0.02575至−0.00663；T13与T21区间跨零。这些区间用于比较当前概率预测，不等同于临床效应区间。</w:t>
       </w:r>
     </w:p>
     <w:p>
@@ -10313,7 +11292,7 @@
           <w:b w:val="0"/>
           <w:sz w:val="24"/>
         </w:rPr>
-        <w:t>表12 女胎模型相对常数率的主体Brier差值</w:t>
+        <w:t>表13 女胎模型相对常数率的主体Brier差值</w:t>
       </w:r>
     </w:p>
     <w:tbl>
@@ -10919,21 +11898,7 @@
           <w:b w:val="0"/>
           <w:sz w:val="24"/>
         </w:rPr>
-        <w:t>问题四的最终产出是带有验证结果和失败边界的异常标记判定流程，而不是可直接用于临床诊断的分类器。附件中的标记可能本身依赖染色体统计量，模型学习到的部分关系可能是原标记规则的再表达；缺少独立确诊金标准时，不能把与标记一致称为确诊准确率。即使主体划分没有泄漏，标签定义层面的依赖仍须单独说明。</w:t>
-      </w:r>
-    </w:p>
-    <w:p>
-      <w:pPr>
-        <w:spacing w:before="0" w:after="0" w:line="264" w:lineRule="auto"/>
-        <w:ind w:firstLine="480"/>
-      </w:pPr>
-      <w:r>
-        <w:rPr>
-          <w:rFonts w:ascii="Times New Roman" w:hAnsi="Times New Roman" w:eastAsia="宋体"/>
-          <w:b w:val="0"/>
-          <w:sz w:val="24"/>
-        </w:rPr>
-        <w:t>稀有阳性主体限制了模型复杂度和校准精度。当前T21只有12名阳性孕妇，增加高容量模型并不能自动产生缺失信息，反而可能扩大方差。改进应优先补充独立阳性样本、核对标签与临床结局关系、预先确定漏诊代价，再比较模型。本文保留低复杂度方法和负面结果，以免用大量算法试验造成选择性报告。</w:t>
+        <w:t>异常标记不是临床确诊金标准，T21仅有12名阳性孕妇；因此MCC方案和高灵敏度方案都应视为训练研究中的筛查对照。实际使用前需补充独立阳性样本、确诊结局和预先确定的漏诊代价。</w:t>
       </w:r>
     </w:p>
     <w:p>
@@ -11113,7 +12078,7 @@
           <w:b w:val="0"/>
           <w:sz w:val="24"/>
         </w:rPr>
-        <w:t>问题四：主体隔离的L2 Logistic流程可以提供各异常标记概率和阈值判定。总体AP为0.3823、Brier为0.08419，T18及总体概率相对常数率有所改善；但T21 AP仅0.0302，总体阈值灵敏度仅0.1791，不支持将当前方法直接用作高敏感临床筛查。图13和表11共同说明概率改善与实际漏判风险需要分别评价。</w:t>
+        <w:t>问题四：主体隔离的L2 Logistic流程可以提供各异常标记概率和阈值判定。总体AP为0.3823、Brier为0.08419；MCC阈值下总体灵敏度为0.1791。高灵敏度约束方案将训练目标设为90%，外层实际灵敏度为0.8955，但特异度降至0.4033，说明漏诊与误报必须按用途选择。T21 AP仅0.0302，仍不支持直接用于高敏感临床筛查。图13、表11和表12共同展示两种阈值口径。</w:t>
       </w:r>
     </w:p>
     <w:p>

</xml_diff>